<commit_message>
Full KB refresh: 104 updated, 7 new files, 4 renamed
New files: _106, _107 (fan), _108 (SPC rack), _109 (guest journey),
_110 (TactSuit Pro), _111 (Unlimited Summer Pass),
Apollo_Master_Verification_Reference_Organized.docx

Renamed: removed CORRECTION__ prefix from _108/_109,
fixed missing underscore on 106, corrected _107 double-underscore

Co-Authored-By: Claude Sonnet 4.6 <noreply@anthropic.com>
</commit_message>
<xml_diff>
--- a/_13_TECH__PASSIVE_TRACKERS_LIMBS_AND_PROPS.docx
+++ b/_13_TECH__PASSIVE_TRACKERS_LIMBS_AND_PROPS.docx
@@ -41,7 +41,7 @@
           <w:pgNumType w:start="1"/>
         </w:sectPr>
       </w:pPr>
-      <w:bookmarkStart w:colFirst="0" w:colLast="0" w:name="_ws7sx9c88q6i" w:id="0"/>
+      <w:bookmarkStart w:colFirst="0" w:colLast="0" w:name="_hwgvm7iihbau" w:id="0"/>
       <w:bookmarkEnd w:id="0"/>
       <w:r>
         <w:rPr>
@@ -13382,7 +13382,7 @@
           <w:pgNumType w:start="1"/>
         </w:sectPr>
       </w:pPr>
-      <w:bookmarkStart w:colFirst="0" w:colLast="0" w:name="_mpyydzqeai3e" w:id="1"/>
+      <w:bookmarkStart w:colFirst="0" w:colLast="0" w:name="_1kogrbyqi0tg" w:id="1"/>
       <w:bookmarkEnd w:id="1"/>
       <w:r>
         <w:rPr>

</xml_diff>